<commit_message>
Add Thai year field and update docx templates
Add a new 'ปีของเลขที่หนังสือ (พ.ศ.)' input (name=no_year) to the academic document form and rename start_day -> start_date. Apply the same HTML changes to the built target/classes copy. Update binary docx templates (doc_3.docx, doc_4.docx) and add an uploaded doc_3.docx under uploads/academic/3. Update .gitignore to ignore common Eclipse/STS project files. Note: an Office temporary file (~$doc_4.docx) was also added in templates/docx.
</commit_message>
<xml_diff>
--- a/shopping-cart-spring-boot-main/src/main/resources/templates/docx/doc_3.docx
+++ b/shopping-cart-spring-boot-main/src/main/resources/templates/docx/doc_3.docx
@@ -184,7 +184,7 @@
                                     </pic:cNvPicPr>
                                   </pic:nvPicPr>
                                   <pic:blipFill>
-                                    <a:blip r:embed="rId6">
+                                    <a:blip r:embed="rId7">
                                       <a:extLst>
                                         <a:ext uri="{28A0092B-C50C-407E-A947-70E740481C1C}">
                                           <a14:useLocalDpi xmlns:a14="http://schemas.microsoft.com/office/drawing/2010/main" val="0"/>
@@ -430,19 +430,8 @@
           <w:color w:val="000000" w:themeColor="text1"/>
           <w:sz w:val="32"/>
           <w:szCs w:val="32"/>
-          <w:cs/>
-        </w:rPr>
-        <w:t>256</w:t>
-      </w:r>
-      <w:r>
-        <w:rPr>
-          <w:rFonts w:ascii="TH Sarabun New" w:hAnsi="TH Sarabun New" w:cs="TH Sarabun New" w:hint="cs"/>
-          <w:color w:val="000000" w:themeColor="text1"/>
-          <w:sz w:val="32"/>
-          <w:szCs w:val="32"/>
-          <w:cs/>
-        </w:rPr>
-        <w:t xml:space="preserve">9 </w:t>
+        </w:rPr>
+        <w:t>{{no._year}}</w:t>
       </w:r>
     </w:p>
     <w:p>
@@ -824,15 +813,7 @@
           <w:sz w:val="32"/>
           <w:szCs w:val="32"/>
         </w:rPr>
-        <w:t>dropdown_position</w:t>
-      </w:r>
-      <w:r>
-        <w:rPr>
-          <w:rFonts w:ascii="TH Sarabun New" w:hAnsi="TH Sarabun New" w:cs="TH Sarabun New"/>
-          <w:sz w:val="32"/>
-          <w:szCs w:val="32"/>
-        </w:rPr>
-        <w:t>nd</w:t>
+        <w:t>dropdown_positionnd</w:t>
       </w:r>
       <w:proofErr w:type="spellEnd"/>
       <w:r>
@@ -1114,15 +1095,7 @@
           <w:sz w:val="32"/>
           <w:szCs w:val="32"/>
         </w:rPr>
-        <w:t>2</w:t>
-      </w:r>
-      <w:r>
-        <w:rPr>
-          <w:rFonts w:ascii="TH Sarabun New" w:hAnsi="TH Sarabun New" w:cs="TH Sarabun New"/>
-          <w:sz w:val="32"/>
-          <w:szCs w:val="32"/>
-        </w:rPr>
-        <w:t>}}</w:t>
+        <w:t>2}}</w:t>
       </w:r>
       <w:r>
         <w:rPr>
@@ -2434,6 +2407,7 @@
   <w:style w:type="character" w:default="1" w:styleId="DefaultParagraphFont">
     <w:name w:val="Default Paragraph Font"/>
     <w:uiPriority w:val="1"/>
+    <w:semiHidden/>
     <w:unhideWhenUsed/>
   </w:style>
   <w:style w:type="table" w:default="1" w:styleId="TableNormal">

</xml_diff>

<commit_message>
Update and add DOCX templates and uploads
Update template DOCX files (src/main/resources/templates/docx/doc_3.docx, doc_4.docx, doc_8.docx), modify uploaded copies (uploads/academic/6/doc_4_copy_1/2/3.docx), and add new uploads for academic/6 (doc_2.docx, doc_5.docx, doc_8.docx). All changes are binary .docx content updates and additions for academic resources.
</commit_message>
<xml_diff>
--- a/shopping-cart-spring-boot-main/src/main/resources/templates/docx/doc_3.docx
+++ b/shopping-cart-spring-boot-main/src/main/resources/templates/docx/doc_3.docx
@@ -5,10 +5,31 @@
     <w:p>
       <w:pPr>
         <w:spacing w:after="0" w:line="240" w:lineRule="auto"/>
-        <w:rPr>
-          <w:rFonts w:ascii="TH Sarabun New" w:hAnsi="TH Sarabun New" w:cs="TH Sarabun New"/>
-          <w:b/>
-          <w:bCs/>
+        <w:jc w:val="center"/>
+        <w:rPr>
+          <w:rFonts w:ascii="TH Sarabun New" w:hAnsi="TH Sarabun New" w:cs="TH Sarabun New"/>
+          <w:sz w:val="32"/>
+          <w:szCs w:val="32"/>
+        </w:rPr>
+      </w:pPr>
+    </w:p>
+    <w:p>
+      <w:pPr>
+        <w:spacing w:after="0" w:line="240" w:lineRule="auto"/>
+        <w:jc w:val="center"/>
+        <w:rPr>
+          <w:rFonts w:ascii="TH Sarabun New" w:hAnsi="TH Sarabun New" w:cs="TH Sarabun New"/>
+          <w:sz w:val="32"/>
+          <w:szCs w:val="32"/>
+        </w:rPr>
+      </w:pPr>
+    </w:p>
+    <w:p>
+      <w:pPr>
+        <w:spacing w:after="0" w:line="240" w:lineRule="auto"/>
+        <w:jc w:val="center"/>
+        <w:rPr>
+          <w:rFonts w:ascii="TH Sarabun New" w:hAnsi="TH Sarabun New" w:cs="TH Sarabun New"/>
           <w:sz w:val="32"/>
           <w:szCs w:val="32"/>
         </w:rPr>
@@ -23,7 +44,7 @@
         <mc:AlternateContent>
           <mc:Choice Requires="wps">
             <w:drawing>
-              <wp:anchor distT="0" distB="0" distL="114300" distR="114300" simplePos="0" relativeHeight="251659264" behindDoc="0" locked="0" layoutInCell="1" allowOverlap="1" wp14:anchorId="6459568D" wp14:editId="525A3EC1">
+              <wp:anchor distT="0" distB="0" distL="114300" distR="114300" simplePos="0" relativeHeight="251659264" behindDoc="0" locked="0" layoutInCell="1" allowOverlap="1" wp14:anchorId="6459568D" wp14:editId="7D154B9C">
                 <wp:simplePos x="0" y="0"/>
                 <wp:positionH relativeFrom="column">
                   <wp:posOffset>2544445</wp:posOffset>
@@ -79,61 +100,7 @@
                       <wps:txbx>
                         <w:txbxContent>
                           <w:p/>
-                          <w:p>
-                            <w:r>
-                              <w:rPr>
-                                <w:noProof/>
-                              </w:rPr>
-                              <w:drawing>
-                                <wp:inline distT="0" distB="0" distL="0" distR="0" wp14:anchorId="4AB524AD" wp14:editId="224CCF99">
-                                  <wp:extent cx="709272" cy="1260000"/>
-                                  <wp:effectExtent l="0" t="0" r="0" b="0"/>
-                                  <wp:docPr id="1" name="รูปภาพ 1" descr="logo_big"/>
-                                  <wp:cNvGraphicFramePr>
-                                    <a:graphicFrameLocks xmlns:a="http://schemas.openxmlformats.org/drawingml/2006/main" noChangeAspect="1"/>
-                                  </wp:cNvGraphicFramePr>
-                                  <a:graphic xmlns:a="http://schemas.openxmlformats.org/drawingml/2006/main">
-                                    <a:graphicData uri="http://schemas.openxmlformats.org/drawingml/2006/picture">
-                                      <pic:pic xmlns:pic="http://schemas.openxmlformats.org/drawingml/2006/picture">
-                                        <pic:nvPicPr>
-                                          <pic:cNvPr id="0" name="Picture 15" descr="logo_big"/>
-                                          <pic:cNvPicPr>
-                                            <a:picLocks noChangeAspect="1" noChangeArrowheads="1"/>
-                                          </pic:cNvPicPr>
-                                        </pic:nvPicPr>
-                                        <pic:blipFill>
-                                          <a:blip r:embed="rId6">
-                                            <a:extLst>
-                                              <a:ext uri="{28A0092B-C50C-407E-A947-70E740481C1C}">
-                                                <a14:useLocalDpi xmlns:a14="http://schemas.microsoft.com/office/drawing/2010/main" val="0"/>
-                                              </a:ext>
-                                            </a:extLst>
-                                          </a:blip>
-                                          <a:srcRect/>
-                                          <a:stretch>
-                                            <a:fillRect/>
-                                          </a:stretch>
-                                        </pic:blipFill>
-                                        <pic:spPr bwMode="auto">
-                                          <a:xfrm>
-                                            <a:off x="0" y="0"/>
-                                            <a:ext cx="709272" cy="1260000"/>
-                                          </a:xfrm>
-                                          <a:prstGeom prst="rect">
-                                            <a:avLst/>
-                                          </a:prstGeom>
-                                          <a:noFill/>
-                                          <a:ln>
-                                            <a:noFill/>
-                                          </a:ln>
-                                        </pic:spPr>
-                                      </pic:pic>
-                                    </a:graphicData>
-                                  </a:graphic>
-                                </wp:inline>
-                              </w:drawing>
-                            </w:r>
-                          </w:p>
+                          <w:p/>
                         </w:txbxContent>
                       </wps:txbx>
                       <wps:bodyPr rot="0" vert="horz" wrap="none" lIns="91440" tIns="45720" rIns="91440" bIns="45720" anchor="t" anchorCtr="0" upright="1">
@@ -157,65 +124,11 @@
                 <v:stroke joinstyle="miter"/>
                 <v:path gradientshapeok="t" o:connecttype="rect"/>
               </v:shapetype>
-              <v:shape id="Text Box 96" o:spid="_x0000_s1026" type="#_x0000_t202" style="position:absolute;margin-left:200.35pt;margin-top:19.15pt;width:78.55pt;height:132.25pt;z-index:251659264;visibility:visible;mso-wrap-style:none;mso-width-percent:0;mso-height-percent:0;mso-wrap-distance-left:9pt;mso-wrap-distance-top:0;mso-wrap-distance-right:9pt;mso-wrap-distance-bottom:0;mso-position-horizontal:absolute;mso-position-horizontal-relative:text;mso-position-vertical:absolute;mso-position-vertical-relative:text;mso-width-percent:0;mso-height-percent:0;mso-width-relative:page;mso-height-relative:page;v-text-anchor:top" o:gfxdata="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" filled="f" stroked="f">
+              <v:shape id="Text Box 96" o:spid="_x0000_s1026" type="#_x0000_t202" style="position:absolute;left:0;text-align:left;margin-left:200.35pt;margin-top:19.15pt;width:78.55pt;height:132.25pt;z-index:251659264;visibility:visible;mso-wrap-style:none;mso-width-percent:0;mso-height-percent:0;mso-wrap-distance-left:9pt;mso-wrap-distance-top:0;mso-wrap-distance-right:9pt;mso-wrap-distance-bottom:0;mso-position-horizontal:absolute;mso-position-horizontal-relative:text;mso-position-vertical:absolute;mso-position-vertical-relative:text;mso-width-percent:0;mso-height-percent:0;mso-width-relative:page;mso-height-relative:page;v-text-anchor:top" o:gfxdata="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" filled="f" stroked="f">
                 <v:textbox style="mso-fit-shape-to-text:t">
                   <w:txbxContent>
                     <w:p/>
-                    <w:p>
-                      <w:r>
-                        <w:rPr>
-                          <w:noProof/>
-                        </w:rPr>
-                        <w:drawing>
-                          <wp:inline distT="0" distB="0" distL="0" distR="0" wp14:anchorId="4AB524AD" wp14:editId="224CCF99">
-                            <wp:extent cx="709272" cy="1260000"/>
-                            <wp:effectExtent l="0" t="0" r="0" b="0"/>
-                            <wp:docPr id="1" name="รูปภาพ 1" descr="logo_big"/>
-                            <wp:cNvGraphicFramePr>
-                              <a:graphicFrameLocks xmlns:a="http://schemas.openxmlformats.org/drawingml/2006/main" noChangeAspect="1"/>
-                            </wp:cNvGraphicFramePr>
-                            <a:graphic xmlns:a="http://schemas.openxmlformats.org/drawingml/2006/main">
-                              <a:graphicData uri="http://schemas.openxmlformats.org/drawingml/2006/picture">
-                                <pic:pic xmlns:pic="http://schemas.openxmlformats.org/drawingml/2006/picture">
-                                  <pic:nvPicPr>
-                                    <pic:cNvPr id="0" name="Picture 15" descr="logo_big"/>
-                                    <pic:cNvPicPr>
-                                      <a:picLocks noChangeAspect="1" noChangeArrowheads="1"/>
-                                    </pic:cNvPicPr>
-                                  </pic:nvPicPr>
-                                  <pic:blipFill>
-                                    <a:blip r:embed="rId7">
-                                      <a:extLst>
-                                        <a:ext uri="{28A0092B-C50C-407E-A947-70E740481C1C}">
-                                          <a14:useLocalDpi xmlns:a14="http://schemas.microsoft.com/office/drawing/2010/main" val="0"/>
-                                        </a:ext>
-                                      </a:extLst>
-                                    </a:blip>
-                                    <a:srcRect/>
-                                    <a:stretch>
-                                      <a:fillRect/>
-                                    </a:stretch>
-                                  </pic:blipFill>
-                                  <pic:spPr bwMode="auto">
-                                    <a:xfrm>
-                                      <a:off x="0" y="0"/>
-                                      <a:ext cx="709272" cy="1260000"/>
-                                    </a:xfrm>
-                                    <a:prstGeom prst="rect">
-                                      <a:avLst/>
-                                    </a:prstGeom>
-                                    <a:noFill/>
-                                    <a:ln>
-                                      <a:noFill/>
-                                    </a:ln>
-                                  </pic:spPr>
-                                </pic:pic>
-                              </a:graphicData>
-                            </a:graphic>
-                          </wp:inline>
-                        </w:drawing>
-                      </w:r>
-                    </w:p>
+                    <w:p/>
                   </w:txbxContent>
                 </v:textbox>
               </v:shape>
@@ -223,10 +136,63 @@
           </mc:Fallback>
         </mc:AlternateContent>
       </w:r>
+      <w:r>
+        <w:rPr>
+          <w:noProof/>
+        </w:rPr>
+        <w:drawing>
+          <wp:inline distT="0" distB="0" distL="0" distR="0" wp14:anchorId="501A9D20" wp14:editId="7A711278">
+            <wp:extent cx="709272" cy="1260000"/>
+            <wp:effectExtent l="0" t="0" r="0" b="0"/>
+            <wp:docPr id="1" name="รูปภาพ 1" descr="logo_big"/>
+            <wp:cNvGraphicFramePr>
+              <a:graphicFrameLocks xmlns:a="http://schemas.openxmlformats.org/drawingml/2006/main" noChangeAspect="1"/>
+            </wp:cNvGraphicFramePr>
+            <a:graphic xmlns:a="http://schemas.openxmlformats.org/drawingml/2006/main">
+              <a:graphicData uri="http://schemas.openxmlformats.org/drawingml/2006/picture">
+                <pic:pic xmlns:pic="http://schemas.openxmlformats.org/drawingml/2006/picture">
+                  <pic:nvPicPr>
+                    <pic:cNvPr id="0" name="Picture 15" descr="logo_big"/>
+                    <pic:cNvPicPr>
+                      <a:picLocks noChangeAspect="1" noChangeArrowheads="1"/>
+                    </pic:cNvPicPr>
+                  </pic:nvPicPr>
+                  <pic:blipFill>
+                    <a:blip r:embed="rId6" cstate="print">
+                      <a:extLst>
+                        <a:ext uri="{28A0092B-C50C-407E-A947-70E740481C1C}">
+                          <a14:useLocalDpi xmlns:a14="http://schemas.microsoft.com/office/drawing/2010/main" val="0"/>
+                        </a:ext>
+                      </a:extLst>
+                    </a:blip>
+                    <a:srcRect/>
+                    <a:stretch>
+                      <a:fillRect/>
+                    </a:stretch>
+                  </pic:blipFill>
+                  <pic:spPr bwMode="auto">
+                    <a:xfrm>
+                      <a:off x="0" y="0"/>
+                      <a:ext cx="709272" cy="1260000"/>
+                    </a:xfrm>
+                    <a:prstGeom prst="rect">
+                      <a:avLst/>
+                    </a:prstGeom>
+                    <a:noFill/>
+                    <a:ln>
+                      <a:noFill/>
+                    </a:ln>
+                  </pic:spPr>
+                </pic:pic>
+              </a:graphicData>
+            </a:graphic>
+          </wp:inline>
+        </w:drawing>
+      </w:r>
     </w:p>
     <w:p>
       <w:pPr>
-        <w:spacing w:line="240" w:lineRule="auto"/>
+        <w:spacing w:after="0" w:line="240" w:lineRule="auto"/>
         <w:rPr>
           <w:rFonts w:ascii="TH Sarabun New" w:hAnsi="TH Sarabun New" w:cs="TH Sarabun New"/>
           <w:sz w:val="32"/>
@@ -236,26 +202,142 @@
     </w:p>
     <w:p>
       <w:pPr>
-        <w:spacing w:line="240" w:lineRule="auto"/>
+        <w:spacing w:after="0" w:line="240" w:lineRule="auto"/>
         <w:jc w:val="center"/>
         <w:rPr>
           <w:rFonts w:ascii="TH Sarabun New" w:hAnsi="TH Sarabun New" w:cs="TH Sarabun New"/>
-          <w:noProof/>
-          <w:sz w:val="32"/>
-          <w:szCs w:val="32"/>
-        </w:rPr>
-      </w:pPr>
+          <w:b/>
+          <w:bCs/>
+          <w:sz w:val="32"/>
+          <w:szCs w:val="32"/>
+          <w:cs/>
+        </w:rPr>
+      </w:pPr>
+      <w:r>
+        <w:rPr>
+          <w:rFonts w:ascii="TH Sarabun New" w:hAnsi="TH Sarabun New" w:cs="TH Sarabun New"/>
+          <w:sz w:val="32"/>
+          <w:szCs w:val="32"/>
+          <w:cs/>
+        </w:rPr>
+        <w:t>คำสั</w:t>
+      </w:r>
+      <w:r>
+        <w:rPr>
+          <w:rFonts w:ascii="TH Sarabun New" w:hAnsi="TH Sarabun New" w:cs="TH Sarabun New" w:hint="cs"/>
+          <w:sz w:val="32"/>
+          <w:szCs w:val="32"/>
+          <w:cs/>
+        </w:rPr>
+        <w:t>่</w:t>
+      </w:r>
+      <w:r>
+        <w:rPr>
+          <w:rFonts w:ascii="TH Sarabun New" w:hAnsi="TH Sarabun New" w:cs="TH Sarabun New" w:hint="cs"/>
+          <w:sz w:val="32"/>
+          <w:szCs w:val="32"/>
+          <w:cs/>
+        </w:rPr>
+        <w:t>งวิทยาลัยการคอมพิวเตอร์</w:t>
+      </w:r>
     </w:p>
     <w:p>
       <w:pPr>
-        <w:spacing w:line="240" w:lineRule="auto"/>
+        <w:spacing w:after="0" w:line="240" w:lineRule="auto"/>
         <w:jc w:val="center"/>
         <w:rPr>
           <w:rFonts w:ascii="TH Sarabun New" w:hAnsi="TH Sarabun New" w:cs="TH Sarabun New"/>
-          <w:sz w:val="32"/>
-          <w:szCs w:val="32"/>
-        </w:rPr>
-      </w:pPr>
+          <w:color w:val="EE0000"/>
+          <w:sz w:val="32"/>
+          <w:szCs w:val="32"/>
+          <w:cs/>
+        </w:rPr>
+      </w:pPr>
+      <w:r>
+        <w:rPr>
+          <w:rFonts w:ascii="TH Sarabun New" w:hAnsi="TH Sarabun New" w:cs="TH Sarabun New" w:hint="cs"/>
+          <w:color w:val="EE0000"/>
+          <w:sz w:val="32"/>
+          <w:szCs w:val="32"/>
+          <w:cs/>
+        </w:rPr>
+        <w:t xml:space="preserve">   </w:t>
+      </w:r>
+      <w:r>
+        <w:rPr>
+          <w:rFonts w:ascii="TH Sarabun New" w:hAnsi="TH Sarabun New" w:cs="TH Sarabun New"/>
+          <w:color w:val="000000" w:themeColor="text1"/>
+          <w:sz w:val="32"/>
+          <w:szCs w:val="32"/>
+          <w:cs/>
+        </w:rPr>
+        <w:t>ที</w:t>
+      </w:r>
+      <w:r>
+        <w:rPr>
+          <w:rFonts w:ascii="TH Sarabun New" w:hAnsi="TH Sarabun New" w:cs="TH Sarabun New" w:hint="cs"/>
+          <w:color w:val="000000" w:themeColor="text1"/>
+          <w:sz w:val="32"/>
+          <w:szCs w:val="32"/>
+          <w:cs/>
+        </w:rPr>
+        <w:t xml:space="preserve">่  </w:t>
+      </w:r>
+      <w:r>
+        <w:rPr>
+          <w:rFonts w:ascii="TH Sarabun New" w:hAnsi="TH Sarabun New" w:cs="TH Sarabun New"/>
+          <w:color w:val="000000" w:themeColor="text1"/>
+          <w:sz w:val="32"/>
+          <w:szCs w:val="32"/>
+        </w:rPr>
+        <w:t>{{</w:t>
+      </w:r>
+      <w:r>
+        <w:rPr>
+          <w:rFonts w:ascii="TH Sarabun New" w:hAnsi="TH Sarabun New" w:cs="TH Sarabun New"/>
+          <w:color w:val="000000" w:themeColor="text1"/>
+          <w:sz w:val="32"/>
+          <w:szCs w:val="32"/>
+        </w:rPr>
+        <w:t>no</w:t>
+      </w:r>
+      <w:r>
+        <w:rPr>
+          <w:rFonts w:ascii="TH Sarabun New" w:hAnsi="TH Sarabun New" w:cs="TH Sarabun New"/>
+          <w:color w:val="000000" w:themeColor="text1"/>
+          <w:sz w:val="32"/>
+          <w:szCs w:val="32"/>
+        </w:rPr>
+        <w:t>}}</w:t>
+      </w:r>
+      <w:r>
+        <w:rPr>
+          <w:rFonts w:ascii="TH Sarabun New" w:hAnsi="TH Sarabun New" w:cs="TH Sarabun New"/>
+          <w:color w:val="000000" w:themeColor="text1"/>
+          <w:sz w:val="32"/>
+          <w:szCs w:val="32"/>
+          <w:cs/>
+        </w:rPr>
+        <w:t>/</w:t>
+      </w:r>
+      <w:r>
+        <w:rPr>
+          <w:rFonts w:ascii="TH Sarabun New" w:hAnsi="TH Sarabun New" w:cs="TH Sarabun New"/>
+          <w:color w:val="000000" w:themeColor="text1"/>
+          <w:sz w:val="32"/>
+          <w:szCs w:val="32"/>
+        </w:rPr>
+        <w:t xml:space="preserve"> </w:t>
+      </w:r>
+      <w:r>
+        <w:rPr>
+          <w:rFonts w:ascii="TH Sarabun New" w:hAnsi="TH Sarabun New" w:cs="TH Sarabun New"/>
+          <w:color w:val="000000" w:themeColor="text1"/>
+          <w:sz w:val="32"/>
+          <w:szCs w:val="32"/>
+        </w:rPr>
+        <w:t>{{no_year}}</w:t>
+      </w:r>
     </w:p>
     <w:p>
       <w:pPr>
@@ -267,6 +349,51 @@
           <w:szCs w:val="32"/>
         </w:rPr>
       </w:pPr>
+      <w:r>
+        <w:rPr>
+          <w:rFonts w:ascii="TH Sarabun New" w:hAnsi="TH Sarabun New" w:cs="TH Sarabun New"/>
+          <w:sz w:val="32"/>
+          <w:szCs w:val="32"/>
+          <w:cs/>
+        </w:rPr>
+        <w:t xml:space="preserve">เรื่อง </w:t>
+      </w:r>
+      <w:r>
+        <w:rPr>
+          <w:rFonts w:ascii="TH Sarabun New" w:hAnsi="TH Sarabun New" w:cs="TH Sarabun New" w:hint="cs"/>
+          <w:sz w:val="32"/>
+          <w:szCs w:val="32"/>
+          <w:cs/>
+        </w:rPr>
+        <w:t xml:space="preserve"> </w:t>
+      </w:r>
+      <w:r>
+        <w:rPr>
+          <w:rFonts w:ascii="TH Sarabun New" w:hAnsi="TH Sarabun New" w:cs="TH Sarabun New"/>
+          <w:sz w:val="32"/>
+          <w:szCs w:val="32"/>
+          <w:cs/>
+        </w:rPr>
+        <w:t>แต่งตั้ง</w:t>
+      </w:r>
+      <w:r>
+        <w:rPr>
+          <w:rFonts w:ascii="TH Sarabun New" w:hAnsi="TH Sarabun New" w:cs="TH Sarabun New" w:hint="cs"/>
+          <w:sz w:val="32"/>
+          <w:szCs w:val="32"/>
+          <w:cs/>
+        </w:rPr>
+        <w:t>คณะกรรม</w:t>
+      </w:r>
+      <w:r>
+        <w:rPr>
+          <w:rFonts w:ascii="TH Sarabun New" w:hAnsi="TH Sarabun New" w:cs="TH Sarabun New" w:hint="cs"/>
+          <w:sz w:val="32"/>
+          <w:szCs w:val="32"/>
+          <w:cs/>
+        </w:rPr>
+        <w:t>การประเมินผลการสอน เพื่อประกอบการพิจารณาแต่งตั้งบุคคล</w:t>
+      </w:r>
     </w:p>
     <w:p>
       <w:pPr>
@@ -285,7 +412,7 @@
           <w:szCs w:val="32"/>
           <w:cs/>
         </w:rPr>
-        <w:t xml:space="preserve"> </w:t>
+        <w:t>ให้ดำรงตำแหน่งทางวิชาการ</w:t>
       </w:r>
     </w:p>
     <w:p>
@@ -296,58 +423,213 @@
           <w:rFonts w:ascii="TH Sarabun New" w:hAnsi="TH Sarabun New" w:cs="TH Sarabun New"/>
           <w:sz w:val="32"/>
           <w:szCs w:val="32"/>
-          <w:cs/>
-        </w:rPr>
-      </w:pPr>
-      <w:r>
-        <w:rPr>
-          <w:rFonts w:ascii="TH Sarabun New" w:hAnsi="TH Sarabun New" w:cs="TH Sarabun New" w:hint="cs"/>
-          <w:sz w:val="32"/>
-          <w:szCs w:val="32"/>
-          <w:cs/>
-        </w:rPr>
-        <w:t xml:space="preserve"> </w:t>
-      </w:r>
-      <w:r>
-        <w:rPr>
-          <w:rFonts w:ascii="TH Sarabun New" w:hAnsi="TH Sarabun New" w:cs="TH Sarabun New"/>
-          <w:sz w:val="32"/>
-          <w:szCs w:val="32"/>
-          <w:cs/>
-        </w:rPr>
-        <w:t>คำสั</w:t>
-      </w:r>
-      <w:r>
-        <w:rPr>
-          <w:rFonts w:ascii="TH Sarabun New" w:hAnsi="TH Sarabun New" w:cs="TH Sarabun New" w:hint="cs"/>
-          <w:sz w:val="32"/>
-          <w:szCs w:val="32"/>
-          <w:cs/>
-        </w:rPr>
-        <w:t>่</w:t>
-      </w:r>
-      <w:r>
-        <w:rPr>
-          <w:rFonts w:ascii="TH Sarabun New" w:hAnsi="TH Sarabun New" w:cs="TH Sarabun New" w:hint="cs"/>
-          <w:sz w:val="32"/>
-          <w:szCs w:val="32"/>
-          <w:cs/>
-        </w:rPr>
-        <w:t>งวิทยาลัยการคอมพิวเตอร์</w:t>
+        </w:rPr>
+      </w:pPr>
+      <w:r>
+        <w:rPr>
+          <w:rFonts w:ascii="TH Sarabun New" w:hAnsi="TH Sarabun New" w:cs="TH Sarabun New" w:hint="cs"/>
+          <w:sz w:val="32"/>
+          <w:szCs w:val="32"/>
+          <w:cs/>
+        </w:rPr>
+        <w:t xml:space="preserve">    </w:t>
+      </w:r>
+      <w:r>
+        <w:rPr>
+          <w:rFonts w:ascii="TH Sarabun New" w:hAnsi="TH Sarabun New" w:cs="TH Sarabun New"/>
+          <w:sz w:val="32"/>
+          <w:szCs w:val="32"/>
+          <w:cs/>
+        </w:rPr>
+        <w:t>...............</w:t>
+      </w:r>
+      <w:r>
+        <w:rPr>
+          <w:rFonts w:ascii="TH Sarabun New" w:hAnsi="TH Sarabun New" w:cs="TH Sarabun New" w:hint="cs"/>
+          <w:sz w:val="32"/>
+          <w:szCs w:val="32"/>
+          <w:cs/>
+        </w:rPr>
+        <w:t>..</w:t>
+      </w:r>
+      <w:r>
+        <w:rPr>
+          <w:rFonts w:ascii="TH Sarabun New" w:hAnsi="TH Sarabun New" w:cs="TH Sarabun New"/>
+          <w:sz w:val="32"/>
+          <w:szCs w:val="32"/>
+          <w:cs/>
+        </w:rPr>
+        <w:t>.....................</w:t>
       </w:r>
     </w:p>
     <w:p>
       <w:pPr>
         <w:spacing w:after="0" w:line="240" w:lineRule="auto"/>
-        <w:jc w:val="center"/>
-        <w:rPr>
-          <w:rFonts w:ascii="TH Sarabun New" w:hAnsi="TH Sarabun New" w:cs="TH Sarabun New"/>
+        <w:jc w:val="thaiDistribute"/>
+        <w:rPr>
+          <w:rFonts w:ascii="TH Sarabun New" w:hAnsi="TH Sarabun New" w:cs="TH Sarabun New"/>
+          <w:sz w:val="32"/>
+          <w:szCs w:val="32"/>
+        </w:rPr>
+      </w:pPr>
+      <w:r>
+        <w:rPr>
+          <w:rFonts w:ascii="TH Sarabun New" w:hAnsi="TH Sarabun New" w:cs="TH Sarabun New"/>
+          <w:sz w:val="32"/>
+          <w:szCs w:val="32"/>
+          <w:cs/>
+        </w:rPr>
+        <w:tab/>
+      </w:r>
+      <w:r>
+        <w:rPr>
+          <w:rFonts w:ascii="TH Sarabun New" w:hAnsi="TH Sarabun New" w:cs="TH Sarabun New"/>
+          <w:sz w:val="32"/>
+          <w:szCs w:val="32"/>
+          <w:cs/>
+        </w:rPr>
+        <w:tab/>
+      </w:r>
+      <w:r>
+        <w:rPr>
+          <w:rFonts w:ascii="TH Sarabun New" w:hAnsi="TH Sarabun New" w:cs="TH Sarabun New" w:hint="cs"/>
+          <w:sz w:val="32"/>
+          <w:szCs w:val="32"/>
+          <w:cs/>
+        </w:rPr>
+        <w:t xml:space="preserve">ตามประกาศมหาวิทยาลัยขอนแก่น (ฉบับที่ </w:t>
+      </w:r>
+      <w:r>
+        <w:rPr>
+          <w:rFonts w:ascii="TH Sarabun New" w:hAnsi="TH Sarabun New" w:cs="TH Sarabun New"/>
+          <w:sz w:val="32"/>
+          <w:szCs w:val="32"/>
+        </w:rPr>
+        <w:t>1607</w:t>
+      </w:r>
+      <w:r>
+        <w:rPr>
+          <w:rFonts w:ascii="TH Sarabun New" w:hAnsi="TH Sarabun New" w:cs="TH Sarabun New" w:hint="cs"/>
+          <w:sz w:val="32"/>
+          <w:szCs w:val="32"/>
+          <w:cs/>
+        </w:rPr>
+        <w:t>/256</w:t>
+      </w:r>
+      <w:r>
+        <w:rPr>
+          <w:rFonts w:ascii="TH Sarabun New" w:hAnsi="TH Sarabun New" w:cs="TH Sarabun New"/>
+          <w:sz w:val="32"/>
+          <w:szCs w:val="32"/>
+        </w:rPr>
+        <w:t>6</w:t>
+      </w:r>
+      <w:r>
+        <w:rPr>
+          <w:rFonts w:ascii="TH Sarabun New" w:hAnsi="TH Sarabun New" w:cs="TH Sarabun New" w:hint="cs"/>
+          <w:sz w:val="32"/>
+          <w:szCs w:val="32"/>
+          <w:cs/>
+        </w:rPr>
+        <w:t xml:space="preserve">) ลงวันที่ </w:t>
+      </w:r>
+      <w:r>
+        <w:rPr>
+          <w:rFonts w:ascii="TH Sarabun New" w:hAnsi="TH Sarabun New" w:cs="TH Sarabun New"/>
+          <w:sz w:val="32"/>
+          <w:szCs w:val="32"/>
+        </w:rPr>
+        <w:t>14</w:t>
+      </w:r>
+      <w:r>
+        <w:rPr>
+          <w:rFonts w:ascii="TH Sarabun New" w:hAnsi="TH Sarabun New" w:cs="TH Sarabun New" w:hint="cs"/>
+          <w:sz w:val="32"/>
+          <w:szCs w:val="32"/>
+          <w:cs/>
+        </w:rPr>
+        <w:t xml:space="preserve"> </w:t>
+      </w:r>
+      <w:r>
+        <w:rPr>
+          <w:rFonts w:ascii="TH Sarabun New" w:hAnsi="TH Sarabun New" w:cs="TH Sarabun New" w:hint="cs"/>
+          <w:sz w:val="32"/>
+          <w:szCs w:val="32"/>
+          <w:cs/>
+        </w:rPr>
+        <w:t>กรกฎาคม</w:t>
+      </w:r>
+      <w:r>
+        <w:rPr>
+          <w:rFonts w:ascii="TH Sarabun New" w:hAnsi="TH Sarabun New" w:cs="TH Sarabun New" w:hint="cs"/>
+          <w:sz w:val="32"/>
+          <w:szCs w:val="32"/>
+          <w:cs/>
+        </w:rPr>
+        <w:t xml:space="preserve"> 256</w:t>
+      </w:r>
+      <w:r>
+        <w:rPr>
+          <w:rFonts w:ascii="TH Sarabun New" w:hAnsi="TH Sarabun New" w:cs="TH Sarabun New" w:hint="cs"/>
+          <w:sz w:val="32"/>
+          <w:szCs w:val="32"/>
+          <w:cs/>
+        </w:rPr>
+        <w:t>6</w:t>
+      </w:r>
+      <w:r>
+        <w:rPr>
+          <w:rFonts w:ascii="TH Sarabun New" w:hAnsi="TH Sarabun New" w:cs="TH Sarabun New" w:hint="cs"/>
+          <w:sz w:val="32"/>
+          <w:szCs w:val="32"/>
+          <w:cs/>
+        </w:rPr>
+        <w:t xml:space="preserve"> เรื่อง หลักเกณฑ์และวิธีการประเมินผลการสอนเพื่อประกอบการพิจารณาแต่งตั้งให้ดำรงตำแหน่งทางวิชาการ นั้น บัดนี้</w:t>
+      </w:r>
+      <w:r>
+        <w:rPr>
+          <w:rFonts w:ascii="TH Sarabun New" w:hAnsi="TH Sarabun New" w:cs="TH Sarabun New" w:hint="cs"/>
+          <w:sz w:val="32"/>
+          <w:szCs w:val="32"/>
+          <w:cs/>
+        </w:rPr>
+        <w:t xml:space="preserve"> </w:t>
+      </w:r>
+      <w:r>
+        <w:rPr>
+          <w:rFonts w:ascii="TH Sarabun New" w:hAnsi="TH Sarabun New" w:cs="TH Sarabun New"/>
+          <w:sz w:val="32"/>
+          <w:szCs w:val="32"/>
+        </w:rPr>
+        <w:t>{{dropdownname_applicant}} {{staff_type}}</w:t>
+      </w:r>
+      <w:r>
+        <w:rPr>
+          <w:rFonts w:ascii="TH Sarabun New" w:hAnsi="TH Sarabun New" w:cs="TH Sarabun New" w:hint="cs"/>
           <w:color w:val="EE0000"/>
           <w:sz w:val="32"/>
           <w:szCs w:val="32"/>
           <w:cs/>
         </w:rPr>
-      </w:pPr>
+        <w:t xml:space="preserve"> </w:t>
+      </w:r>
+      <w:r>
+        <w:rPr>
+          <w:rFonts w:ascii="TH Sarabun New" w:hAnsi="TH Sarabun New" w:cs="TH Sarabun New" w:hint="cs"/>
+          <w:sz w:val="32"/>
+          <w:szCs w:val="32"/>
+          <w:cs/>
+        </w:rPr>
+        <w:t xml:space="preserve">ตำแหน่ง </w:t>
+      </w:r>
+      <w:r>
+        <w:rPr>
+          <w:rFonts w:ascii="TH Sarabun New" w:hAnsi="TH Sarabun New" w:cs="TH Sarabun New"/>
+          <w:sz w:val="32"/>
+          <w:szCs w:val="32"/>
+        </w:rPr>
+        <w:t>{{dropdown_position}}</w:t>
+      </w:r>
       <w:r>
         <w:rPr>
           <w:rFonts w:ascii="TH Sarabun New" w:hAnsi="TH Sarabun New" w:cs="TH Sarabun New" w:hint="cs"/>
@@ -356,441 +638,10 @@
           <w:szCs w:val="32"/>
           <w:cs/>
         </w:rPr>
-        <w:t xml:space="preserve">   </w:t>
-      </w:r>
-      <w:r>
-        <w:rPr>
-          <w:rFonts w:ascii="TH Sarabun New" w:hAnsi="TH Sarabun New" w:cs="TH Sarabun New"/>
-          <w:color w:val="000000" w:themeColor="text1"/>
-          <w:sz w:val="32"/>
-          <w:szCs w:val="32"/>
-          <w:cs/>
-        </w:rPr>
-        <w:t>ที</w:t>
-      </w:r>
-      <w:r>
-        <w:rPr>
-          <w:rFonts w:ascii="TH Sarabun New" w:hAnsi="TH Sarabun New" w:cs="TH Sarabun New" w:hint="cs"/>
-          <w:color w:val="000000" w:themeColor="text1"/>
-          <w:sz w:val="32"/>
-          <w:szCs w:val="32"/>
-          <w:cs/>
-        </w:rPr>
-        <w:t xml:space="preserve">่  </w:t>
-      </w:r>
-      <w:r>
-        <w:rPr>
-          <w:rFonts w:ascii="TH Sarabun New" w:hAnsi="TH Sarabun New" w:cs="TH Sarabun New"/>
-          <w:color w:val="000000" w:themeColor="text1"/>
-          <w:sz w:val="32"/>
-          <w:szCs w:val="32"/>
-        </w:rPr>
-        <w:t>{{</w:t>
-      </w:r>
-      <w:r>
-        <w:rPr>
-          <w:rFonts w:ascii="TH Sarabun New" w:hAnsi="TH Sarabun New" w:cs="TH Sarabun New"/>
-          <w:color w:val="000000" w:themeColor="text1"/>
-          <w:sz w:val="32"/>
-          <w:szCs w:val="32"/>
-        </w:rPr>
-        <w:t>no.</w:t>
-      </w:r>
-      <w:r>
-        <w:rPr>
-          <w:rFonts w:ascii="TH Sarabun New" w:hAnsi="TH Sarabun New" w:cs="TH Sarabun New"/>
-          <w:color w:val="000000" w:themeColor="text1"/>
-          <w:sz w:val="32"/>
-          <w:szCs w:val="32"/>
-        </w:rPr>
-        <w:t>}}</w:t>
-      </w:r>
-      <w:r>
-        <w:rPr>
-          <w:rFonts w:ascii="TH Sarabun New" w:hAnsi="TH Sarabun New" w:cs="TH Sarabun New"/>
-          <w:color w:val="000000" w:themeColor="text1"/>
-          <w:sz w:val="32"/>
-          <w:szCs w:val="32"/>
-          <w:cs/>
-        </w:rPr>
-        <w:t>/</w:t>
-      </w:r>
-      <w:r>
-        <w:rPr>
-          <w:rFonts w:ascii="TH Sarabun New" w:hAnsi="TH Sarabun New" w:cs="TH Sarabun New"/>
-          <w:color w:val="000000" w:themeColor="text1"/>
-          <w:sz w:val="32"/>
-          <w:szCs w:val="32"/>
-        </w:rPr>
         <w:t xml:space="preserve"> </w:t>
       </w:r>
       <w:r>
         <w:rPr>
-          <w:rFonts w:ascii="TH Sarabun New" w:hAnsi="TH Sarabun New" w:cs="TH Sarabun New"/>
-          <w:color w:val="000000" w:themeColor="text1"/>
-          <w:sz w:val="32"/>
-          <w:szCs w:val="32"/>
-        </w:rPr>
-        <w:t>{{no._year}}</w:t>
-      </w:r>
-    </w:p>
-    <w:p>
-      <w:pPr>
-        <w:spacing w:after="0" w:line="240" w:lineRule="auto"/>
-        <w:jc w:val="center"/>
-        <w:rPr>
-          <w:rFonts w:ascii="TH Sarabun New" w:hAnsi="TH Sarabun New" w:cs="TH Sarabun New"/>
-          <w:sz w:val="32"/>
-          <w:szCs w:val="32"/>
-        </w:rPr>
-      </w:pPr>
-      <w:r>
-        <w:rPr>
-          <w:rFonts w:ascii="TH Sarabun New" w:hAnsi="TH Sarabun New" w:cs="TH Sarabun New"/>
-          <w:sz w:val="32"/>
-          <w:szCs w:val="32"/>
-          <w:cs/>
-        </w:rPr>
-        <w:t xml:space="preserve">เรื่อง </w:t>
-      </w:r>
-      <w:r>
-        <w:rPr>
-          <w:rFonts w:ascii="TH Sarabun New" w:hAnsi="TH Sarabun New" w:cs="TH Sarabun New" w:hint="cs"/>
-          <w:sz w:val="32"/>
-          <w:szCs w:val="32"/>
-          <w:cs/>
-        </w:rPr>
-        <w:t xml:space="preserve"> </w:t>
-      </w:r>
-      <w:r>
-        <w:rPr>
-          <w:rFonts w:ascii="TH Sarabun New" w:hAnsi="TH Sarabun New" w:cs="TH Sarabun New"/>
-          <w:sz w:val="32"/>
-          <w:szCs w:val="32"/>
-          <w:cs/>
-        </w:rPr>
-        <w:t>แต่งตั้ง</w:t>
-      </w:r>
-      <w:r>
-        <w:rPr>
-          <w:rFonts w:ascii="TH Sarabun New" w:hAnsi="TH Sarabun New" w:cs="TH Sarabun New" w:hint="cs"/>
-          <w:sz w:val="32"/>
-          <w:szCs w:val="32"/>
-          <w:cs/>
-        </w:rPr>
-        <w:t>คณะกรรม</w:t>
-      </w:r>
-      <w:r>
-        <w:rPr>
-          <w:rFonts w:ascii="TH Sarabun New" w:hAnsi="TH Sarabun New" w:cs="TH Sarabun New" w:hint="cs"/>
-          <w:sz w:val="32"/>
-          <w:szCs w:val="32"/>
-          <w:cs/>
-        </w:rPr>
-        <w:t>การประเมินผลการสอน เพื่อประกอบการพิจารณาแต่งตั้งบุคคล</w:t>
-      </w:r>
-    </w:p>
-    <w:p>
-      <w:pPr>
-        <w:spacing w:after="0" w:line="240" w:lineRule="auto"/>
-        <w:jc w:val="center"/>
-        <w:rPr>
-          <w:rFonts w:ascii="TH Sarabun New" w:hAnsi="TH Sarabun New" w:cs="TH Sarabun New"/>
-          <w:sz w:val="32"/>
-          <w:szCs w:val="32"/>
-        </w:rPr>
-      </w:pPr>
-      <w:r>
-        <w:rPr>
-          <w:rFonts w:ascii="TH Sarabun New" w:hAnsi="TH Sarabun New" w:cs="TH Sarabun New" w:hint="cs"/>
-          <w:sz w:val="32"/>
-          <w:szCs w:val="32"/>
-          <w:cs/>
-        </w:rPr>
-        <w:t>ให้ดำรงตำแหน่งทางวิชาการ</w:t>
-      </w:r>
-    </w:p>
-    <w:p>
-      <w:pPr>
-        <w:spacing w:after="0" w:line="240" w:lineRule="auto"/>
-        <w:jc w:val="center"/>
-        <w:rPr>
-          <w:rFonts w:ascii="TH Sarabun New" w:hAnsi="TH Sarabun New" w:cs="TH Sarabun New"/>
-          <w:sz w:val="32"/>
-          <w:szCs w:val="32"/>
-        </w:rPr>
-      </w:pPr>
-      <w:r>
-        <w:rPr>
-          <w:rFonts w:ascii="TH Sarabun New" w:hAnsi="TH Sarabun New" w:cs="TH Sarabun New" w:hint="cs"/>
-          <w:sz w:val="32"/>
-          <w:szCs w:val="32"/>
-          <w:cs/>
-        </w:rPr>
-        <w:t xml:space="preserve">    </w:t>
-      </w:r>
-      <w:r>
-        <w:rPr>
-          <w:rFonts w:ascii="TH Sarabun New" w:hAnsi="TH Sarabun New" w:cs="TH Sarabun New"/>
-          <w:sz w:val="32"/>
-          <w:szCs w:val="32"/>
-          <w:cs/>
-        </w:rPr>
-        <w:t>...............</w:t>
-      </w:r>
-      <w:r>
-        <w:rPr>
-          <w:rFonts w:ascii="TH Sarabun New" w:hAnsi="TH Sarabun New" w:cs="TH Sarabun New" w:hint="cs"/>
-          <w:sz w:val="32"/>
-          <w:szCs w:val="32"/>
-          <w:cs/>
-        </w:rPr>
-        <w:t>..</w:t>
-      </w:r>
-      <w:r>
-        <w:rPr>
-          <w:rFonts w:ascii="TH Sarabun New" w:hAnsi="TH Sarabun New" w:cs="TH Sarabun New"/>
-          <w:sz w:val="32"/>
-          <w:szCs w:val="32"/>
-          <w:cs/>
-        </w:rPr>
-        <w:t>.....................</w:t>
-      </w:r>
-    </w:p>
-    <w:p>
-      <w:pPr>
-        <w:spacing w:after="0" w:line="240" w:lineRule="auto"/>
-        <w:jc w:val="thaiDistribute"/>
-        <w:rPr>
-          <w:rFonts w:ascii="TH Sarabun New" w:hAnsi="TH Sarabun New" w:cs="TH Sarabun New"/>
-          <w:sz w:val="32"/>
-          <w:szCs w:val="32"/>
-        </w:rPr>
-      </w:pPr>
-      <w:r>
-        <w:rPr>
-          <w:rFonts w:ascii="TH Sarabun New" w:hAnsi="TH Sarabun New" w:cs="TH Sarabun New"/>
-          <w:sz w:val="32"/>
-          <w:szCs w:val="32"/>
-          <w:cs/>
-        </w:rPr>
-        <w:tab/>
-      </w:r>
-      <w:r>
-        <w:rPr>
-          <w:rFonts w:ascii="TH Sarabun New" w:hAnsi="TH Sarabun New" w:cs="TH Sarabun New"/>
-          <w:sz w:val="32"/>
-          <w:szCs w:val="32"/>
-          <w:cs/>
-        </w:rPr>
-        <w:tab/>
-      </w:r>
-      <w:r>
-        <w:rPr>
-          <w:rFonts w:ascii="TH Sarabun New" w:hAnsi="TH Sarabun New" w:cs="TH Sarabun New" w:hint="cs"/>
-          <w:sz w:val="32"/>
-          <w:szCs w:val="32"/>
-          <w:cs/>
-        </w:rPr>
-        <w:t xml:space="preserve">ตามประกาศมหาวิทยาลัยขอนแก่น (ฉบับที่ </w:t>
-      </w:r>
-      <w:r>
-        <w:rPr>
-          <w:rFonts w:ascii="TH Sarabun New" w:hAnsi="TH Sarabun New" w:cs="TH Sarabun New"/>
-          <w:sz w:val="32"/>
-          <w:szCs w:val="32"/>
-        </w:rPr>
-        <w:t>1607</w:t>
-      </w:r>
-      <w:r>
-        <w:rPr>
-          <w:rFonts w:ascii="TH Sarabun New" w:hAnsi="TH Sarabun New" w:cs="TH Sarabun New" w:hint="cs"/>
-          <w:sz w:val="32"/>
-          <w:szCs w:val="32"/>
-          <w:cs/>
-        </w:rPr>
-        <w:t>/256</w:t>
-      </w:r>
-      <w:r>
-        <w:rPr>
-          <w:rFonts w:ascii="TH Sarabun New" w:hAnsi="TH Sarabun New" w:cs="TH Sarabun New"/>
-          <w:sz w:val="32"/>
-          <w:szCs w:val="32"/>
-        </w:rPr>
-        <w:t>6</w:t>
-      </w:r>
-      <w:r>
-        <w:rPr>
-          <w:rFonts w:ascii="TH Sarabun New" w:hAnsi="TH Sarabun New" w:cs="TH Sarabun New" w:hint="cs"/>
-          <w:sz w:val="32"/>
-          <w:szCs w:val="32"/>
-          <w:cs/>
-        </w:rPr>
-        <w:t xml:space="preserve">) ลงวันที่ </w:t>
-      </w:r>
-      <w:r>
-        <w:rPr>
-          <w:rFonts w:ascii="TH Sarabun New" w:hAnsi="TH Sarabun New" w:cs="TH Sarabun New"/>
-          <w:sz w:val="32"/>
-          <w:szCs w:val="32"/>
-        </w:rPr>
-        <w:t>14</w:t>
-      </w:r>
-      <w:r>
-        <w:rPr>
-          <w:rFonts w:ascii="TH Sarabun New" w:hAnsi="TH Sarabun New" w:cs="TH Sarabun New" w:hint="cs"/>
-          <w:sz w:val="32"/>
-          <w:szCs w:val="32"/>
-          <w:cs/>
-        </w:rPr>
-        <w:t xml:space="preserve"> </w:t>
-      </w:r>
-      <w:r>
-        <w:rPr>
-          <w:rFonts w:ascii="TH Sarabun New" w:hAnsi="TH Sarabun New" w:cs="TH Sarabun New" w:hint="cs"/>
-          <w:sz w:val="32"/>
-          <w:szCs w:val="32"/>
-          <w:cs/>
-        </w:rPr>
-        <w:t>กรกฎาคม</w:t>
-      </w:r>
-      <w:r>
-        <w:rPr>
-          <w:rFonts w:ascii="TH Sarabun New" w:hAnsi="TH Sarabun New" w:cs="TH Sarabun New" w:hint="cs"/>
-          <w:sz w:val="32"/>
-          <w:szCs w:val="32"/>
-          <w:cs/>
-        </w:rPr>
-        <w:t xml:space="preserve"> 256</w:t>
-      </w:r>
-      <w:r>
-        <w:rPr>
-          <w:rFonts w:ascii="TH Sarabun New" w:hAnsi="TH Sarabun New" w:cs="TH Sarabun New" w:hint="cs"/>
-          <w:sz w:val="32"/>
-          <w:szCs w:val="32"/>
-          <w:cs/>
-        </w:rPr>
-        <w:t>6</w:t>
-      </w:r>
-      <w:r>
-        <w:rPr>
-          <w:rFonts w:ascii="TH Sarabun New" w:hAnsi="TH Sarabun New" w:cs="TH Sarabun New" w:hint="cs"/>
-          <w:sz w:val="32"/>
-          <w:szCs w:val="32"/>
-          <w:cs/>
-        </w:rPr>
-        <w:t xml:space="preserve"> เรื่อง หลักเกณฑ์และวิธีการประเมินผลการสอนเพื่อประกอบการพิจารณาแต่งตั้งให้ดำรงตำแหน่งทางวิชาการ นั้น บัดนี้</w:t>
-      </w:r>
-      <w:r>
-        <w:rPr>
-          <w:rFonts w:ascii="TH Sarabun New" w:hAnsi="TH Sarabun New" w:cs="TH Sarabun New" w:hint="cs"/>
-          <w:sz w:val="32"/>
-          <w:szCs w:val="32"/>
-          <w:cs/>
-        </w:rPr>
-        <w:t xml:space="preserve"> </w:t>
-      </w:r>
-      <w:r>
-        <w:rPr>
-          <w:rFonts w:ascii="TH Sarabun New" w:hAnsi="TH Sarabun New" w:cs="TH Sarabun New"/>
-          <w:sz w:val="32"/>
-          <w:szCs w:val="32"/>
-        </w:rPr>
-        <w:t>{{</w:t>
-      </w:r>
-      <w:proofErr w:type="spellStart"/>
-      <w:r>
-        <w:rPr>
-          <w:rFonts w:ascii="TH Sarabun New" w:hAnsi="TH Sarabun New" w:cs="TH Sarabun New"/>
-          <w:sz w:val="32"/>
-          <w:szCs w:val="32"/>
-        </w:rPr>
-        <w:t>dropdownname_applicant</w:t>
-      </w:r>
-      <w:proofErr w:type="spellEnd"/>
-      <w:r>
-        <w:rPr>
-          <w:rFonts w:ascii="TH Sarabun New" w:hAnsi="TH Sarabun New" w:cs="TH Sarabun New"/>
-          <w:sz w:val="32"/>
-          <w:szCs w:val="32"/>
-        </w:rPr>
-        <w:t>}} {{</w:t>
-      </w:r>
-      <w:proofErr w:type="spellStart"/>
-      <w:r>
-        <w:rPr>
-          <w:rFonts w:ascii="TH Sarabun New" w:hAnsi="TH Sarabun New" w:cs="TH Sarabun New"/>
-          <w:sz w:val="32"/>
-          <w:szCs w:val="32"/>
-        </w:rPr>
-        <w:t>staff_type</w:t>
-      </w:r>
-      <w:proofErr w:type="spellEnd"/>
-      <w:r>
-        <w:rPr>
-          <w:rFonts w:ascii="TH Sarabun New" w:hAnsi="TH Sarabun New" w:cs="TH Sarabun New"/>
-          <w:sz w:val="32"/>
-          <w:szCs w:val="32"/>
-        </w:rPr>
-        <w:t>}}</w:t>
-      </w:r>
-      <w:r>
-        <w:rPr>
-          <w:rFonts w:ascii="TH Sarabun New" w:hAnsi="TH Sarabun New" w:cs="TH Sarabun New" w:hint="cs"/>
-          <w:color w:val="EE0000"/>
-          <w:sz w:val="32"/>
-          <w:szCs w:val="32"/>
-          <w:cs/>
-        </w:rPr>
-        <w:t xml:space="preserve"> </w:t>
-      </w:r>
-      <w:r>
-        <w:rPr>
-          <w:rFonts w:ascii="TH Sarabun New" w:hAnsi="TH Sarabun New" w:cs="TH Sarabun New" w:hint="cs"/>
-          <w:sz w:val="32"/>
-          <w:szCs w:val="32"/>
-          <w:cs/>
-        </w:rPr>
-        <w:t xml:space="preserve">ตำแหน่ง </w:t>
-      </w:r>
-      <w:r>
-        <w:rPr>
-          <w:rFonts w:ascii="TH Sarabun New" w:hAnsi="TH Sarabun New" w:cs="TH Sarabun New"/>
-          <w:sz w:val="32"/>
-          <w:szCs w:val="32"/>
-        </w:rPr>
-        <w:t>{{</w:t>
-      </w:r>
-      <w:proofErr w:type="spellStart"/>
-      <w:r>
-        <w:rPr>
-          <w:rFonts w:ascii="TH Sarabun New" w:hAnsi="TH Sarabun New" w:cs="TH Sarabun New"/>
-          <w:sz w:val="32"/>
-          <w:szCs w:val="32"/>
-        </w:rPr>
-        <w:t>dropdown_position</w:t>
-      </w:r>
-      <w:proofErr w:type="spellEnd"/>
-      <w:r>
-        <w:rPr>
-          <w:rFonts w:ascii="TH Sarabun New" w:hAnsi="TH Sarabun New" w:cs="TH Sarabun New"/>
-          <w:sz w:val="32"/>
-          <w:szCs w:val="32"/>
-        </w:rPr>
-        <w:t>}}</w:t>
-      </w:r>
-      <w:r>
-        <w:rPr>
-          <w:rFonts w:ascii="TH Sarabun New" w:hAnsi="TH Sarabun New" w:cs="TH Sarabun New" w:hint="cs"/>
-          <w:color w:val="EE0000"/>
-          <w:sz w:val="32"/>
-          <w:szCs w:val="32"/>
-          <w:cs/>
-        </w:rPr>
-        <w:t xml:space="preserve"> </w:t>
-      </w:r>
-      <w:r>
-        <w:rPr>
           <w:rFonts w:ascii="TH Sarabun New" w:hAnsi="TH Sarabun New" w:cs="TH Sarabun New" w:hint="cs"/>
           <w:sz w:val="32"/>
           <w:szCs w:val="32"/>
@@ -804,25 +655,7 @@
           <w:sz w:val="32"/>
           <w:szCs w:val="32"/>
         </w:rPr>
-        <w:t>{{</w:t>
-      </w:r>
-      <w:proofErr w:type="spellStart"/>
-      <w:r>
-        <w:rPr>
-          <w:rFonts w:ascii="TH Sarabun New" w:hAnsi="TH Sarabun New" w:cs="TH Sarabun New"/>
-          <w:sz w:val="32"/>
-          <w:szCs w:val="32"/>
-        </w:rPr>
-        <w:t>dropdown_positionnd</w:t>
-      </w:r>
-      <w:proofErr w:type="spellEnd"/>
-      <w:r>
-        <w:rPr>
-          <w:rFonts w:ascii="TH Sarabun New" w:hAnsi="TH Sarabun New" w:cs="TH Sarabun New"/>
-          <w:sz w:val="32"/>
-          <w:szCs w:val="32"/>
-        </w:rPr>
-        <w:t>}}</w:t>
+        <w:t>{{dropdown_positionnd}}</w:t>
       </w:r>
     </w:p>
     <w:p>
@@ -918,7 +751,7 @@
     </w:p>
     <w:p>
       <w:pPr>
-        <w:pStyle w:val="ListParagraph"/>
+        <w:pStyle w:val="a3"/>
         <w:spacing w:line="240" w:lineRule="auto"/>
         <w:ind w:left="1530"/>
         <w:jc w:val="thaiDistribute"/>
@@ -1037,7 +870,7 @@
     </w:p>
     <w:p>
       <w:pPr>
-        <w:pStyle w:val="ListParagraph"/>
+        <w:pStyle w:val="a3"/>
         <w:spacing w:line="240" w:lineRule="auto"/>
         <w:ind w:left="1530"/>
         <w:jc w:val="thaiDistribute"/>
@@ -1153,7 +986,7 @@
     </w:p>
     <w:p>
       <w:pPr>
-        <w:pStyle w:val="ListParagraph"/>
+        <w:pStyle w:val="a3"/>
         <w:spacing w:line="240" w:lineRule="auto"/>
         <w:ind w:left="1530"/>
         <w:jc w:val="thaiDistribute"/>
@@ -1323,7 +1156,6 @@
         </w:rPr>
         <w:t>{{</w:t>
       </w:r>
-      <w:proofErr w:type="spellStart"/>
       <w:r>
         <w:rPr>
           <w:rFonts w:ascii="TH Sarabun New" w:hAnsi="TH Sarabun New" w:cs="TH Sarabun New"/>
@@ -1342,7 +1174,6 @@
         </w:rPr>
         <w:t>date</w:t>
       </w:r>
-      <w:proofErr w:type="spellEnd"/>
       <w:r>
         <w:rPr>
           <w:rFonts w:ascii="TH Sarabun New" w:hAnsi="TH Sarabun New" w:cs="TH Sarabun New"/>
@@ -1371,7 +1202,6 @@
         </w:rPr>
         <w:t>{{</w:t>
       </w:r>
-      <w:proofErr w:type="spellStart"/>
       <w:r>
         <w:rPr>
           <w:rFonts w:ascii="TH Sarabun New" w:hAnsi="TH Sarabun New" w:cs="TH Sarabun New"/>
@@ -1390,7 +1220,6 @@
         </w:rPr>
         <w:t>month</w:t>
       </w:r>
-      <w:proofErr w:type="spellEnd"/>
       <w:r>
         <w:rPr>
           <w:rFonts w:ascii="TH Sarabun New" w:hAnsi="TH Sarabun New" w:cs="TH Sarabun New"/>
@@ -1467,7 +1296,6 @@
         </w:rPr>
         <w:t>{{</w:t>
       </w:r>
-      <w:proofErr w:type="spellStart"/>
       <w:r>
         <w:rPr>
           <w:rFonts w:ascii="TH Sarabun New" w:hAnsi="TH Sarabun New" w:cs="TH Sarabun New"/>
@@ -1486,7 +1314,6 @@
         </w:rPr>
         <w:t>year</w:t>
       </w:r>
-      <w:proofErr w:type="spellEnd"/>
       <w:r>
         <w:rPr>
           <w:rFonts w:ascii="TH Sarabun New" w:hAnsi="TH Sarabun New" w:cs="TH Sarabun New"/>
@@ -1563,27 +1390,7 @@
           <w:sz w:val="32"/>
           <w:szCs w:val="32"/>
         </w:rPr>
-        <w:t>{{</w:t>
-      </w:r>
-      <w:proofErr w:type="spellStart"/>
-      <w:r>
-        <w:rPr>
-          <w:rFonts w:ascii="TH Sarabun New" w:hAnsi="TH Sarabun New" w:cs="TH Sarabun New"/>
-          <w:color w:val="000000" w:themeColor="text1"/>
-          <w:sz w:val="32"/>
-          <w:szCs w:val="32"/>
-        </w:rPr>
-        <w:t>signed_day</w:t>
-      </w:r>
-      <w:proofErr w:type="spellEnd"/>
-      <w:r>
-        <w:rPr>
-          <w:rFonts w:ascii="TH Sarabun New" w:hAnsi="TH Sarabun New" w:cs="TH Sarabun New"/>
-          <w:color w:val="000000" w:themeColor="text1"/>
-          <w:sz w:val="32"/>
-          <w:szCs w:val="32"/>
-        </w:rPr>
-        <w:t>}}</w:t>
+        <w:t>{{signed_day}}</w:t>
       </w:r>
       <w:r>
         <w:rPr>
@@ -1602,27 +1409,7 @@
           <w:sz w:val="32"/>
           <w:szCs w:val="32"/>
         </w:rPr>
-        <w:t>{{</w:t>
-      </w:r>
-      <w:proofErr w:type="spellStart"/>
-      <w:r>
-        <w:rPr>
-          <w:rFonts w:ascii="TH Sarabun New" w:hAnsi="TH Sarabun New" w:cs="TH Sarabun New"/>
-          <w:color w:val="000000" w:themeColor="text1"/>
-          <w:sz w:val="32"/>
-          <w:szCs w:val="32"/>
-        </w:rPr>
-        <w:t>signed_month</w:t>
-      </w:r>
-      <w:proofErr w:type="spellEnd"/>
-      <w:r>
-        <w:rPr>
-          <w:rFonts w:ascii="TH Sarabun New" w:hAnsi="TH Sarabun New" w:cs="TH Sarabun New"/>
-          <w:color w:val="000000" w:themeColor="text1"/>
-          <w:sz w:val="32"/>
-          <w:szCs w:val="32"/>
-        </w:rPr>
-        <w:t xml:space="preserve">}} </w:t>
+        <w:t xml:space="preserve">{{signed_month}} </w:t>
       </w:r>
       <w:r>
         <w:rPr>
@@ -1660,27 +1447,7 @@
           <w:sz w:val="32"/>
           <w:szCs w:val="32"/>
         </w:rPr>
-        <w:t>.{{</w:t>
-      </w:r>
-      <w:proofErr w:type="spellStart"/>
-      <w:r>
-        <w:rPr>
-          <w:rFonts w:ascii="TH Sarabun New" w:hAnsi="TH Sarabun New" w:cs="TH Sarabun New"/>
-          <w:color w:val="000000" w:themeColor="text1"/>
-          <w:sz w:val="32"/>
-          <w:szCs w:val="32"/>
-        </w:rPr>
-        <w:t>signed_year</w:t>
-      </w:r>
-      <w:proofErr w:type="spellEnd"/>
-      <w:r>
-        <w:rPr>
-          <w:rFonts w:ascii="TH Sarabun New" w:hAnsi="TH Sarabun New" w:cs="TH Sarabun New"/>
-          <w:color w:val="000000" w:themeColor="text1"/>
-          <w:sz w:val="32"/>
-          <w:szCs w:val="32"/>
-        </w:rPr>
-        <w:t>}}</w:t>
+        <w:t>.{{signed_year}}</w:t>
       </w:r>
       <w:r>
         <w:rPr>
@@ -1746,7 +1513,6 @@
         </w:rPr>
         <w:t>{{</w:t>
       </w:r>
-      <w:proofErr w:type="spellStart"/>
       <w:r>
         <w:rPr>
           <w:rFonts w:ascii="TH Sarabun New" w:hAnsi="TH Sarabun New" w:cs="TH Sarabun New"/>
@@ -1756,7 +1522,6 @@
         </w:rPr>
         <w:t>dean_name</w:t>
       </w:r>
-      <w:proofErr w:type="spellEnd"/>
       <w:r>
         <w:rPr>
           <w:rFonts w:ascii="TH Sarabun New" w:hAnsi="TH Sarabun New" w:cs="TH Sarabun New"/>
@@ -1795,17 +1560,7 @@
           <w:sz w:val="32"/>
           <w:szCs w:val="32"/>
         </w:rPr>
-        <w:t>{{</w:t>
-      </w:r>
-      <w:proofErr w:type="spellStart"/>
-      <w:r>
-        <w:rPr>
-          <w:rFonts w:ascii="TH Sarabun New" w:hAnsi="TH Sarabun New" w:cs="TH Sarabun New"/>
-          <w:color w:val="000000" w:themeColor="text1"/>
-          <w:sz w:val="32"/>
-          <w:szCs w:val="32"/>
-        </w:rPr>
-        <w:t>dean</w:t>
+        <w:t>{{dean</w:t>
       </w:r>
       <w:r>
         <w:rPr>
@@ -1823,17 +1578,7 @@
           <w:sz w:val="32"/>
           <w:szCs w:val="32"/>
         </w:rPr>
-        <w:t>_position</w:t>
-      </w:r>
-      <w:proofErr w:type="spellEnd"/>
-      <w:r>
-        <w:rPr>
-          <w:rFonts w:ascii="TH Sarabun New" w:hAnsi="TH Sarabun New" w:cs="TH Sarabun New"/>
-          <w:color w:val="000000" w:themeColor="text1"/>
-          <w:sz w:val="32"/>
-          <w:szCs w:val="32"/>
-        </w:rPr>
-        <w:t>}}</w:t>
+        <w:t>_position}}</w:t>
       </w:r>
     </w:p>
     <w:p>
@@ -2392,7 +2137,7 @@
     <w:lsdException w:name="Unresolved Mention" w:semiHidden="1" w:unhideWhenUsed="1"/>
     <w:lsdException w:name="Smart Link" w:semiHidden="1" w:unhideWhenUsed="1"/>
   </w:latentStyles>
-  <w:style w:type="paragraph" w:default="1" w:styleId="Normal">
+  <w:style w:type="paragraph" w:default="1" w:styleId="a">
     <w:name w:val="Normal"/>
     <w:qFormat/>
     <w:rsid w:val="00FF5D67"/>
@@ -2404,13 +2149,13 @@
       <w:sz w:val="24"/>
     </w:rPr>
   </w:style>
-  <w:style w:type="character" w:default="1" w:styleId="DefaultParagraphFont">
+  <w:style w:type="character" w:default="1" w:styleId="a0">
     <w:name w:val="Default Paragraph Font"/>
     <w:uiPriority w:val="1"/>
     <w:semiHidden/>
     <w:unhideWhenUsed/>
   </w:style>
-  <w:style w:type="table" w:default="1" w:styleId="TableNormal">
+  <w:style w:type="table" w:default="1" w:styleId="a1">
     <w:name w:val="Normal Table"/>
     <w:uiPriority w:val="99"/>
     <w:semiHidden/>
@@ -2425,15 +2170,15 @@
       </w:tblCellMar>
     </w:tblPr>
   </w:style>
-  <w:style w:type="numbering" w:default="1" w:styleId="NoList">
+  <w:style w:type="numbering" w:default="1" w:styleId="a2">
     <w:name w:val="No List"/>
     <w:uiPriority w:val="99"/>
     <w:semiHidden/>
     <w:unhideWhenUsed/>
   </w:style>
-  <w:style w:type="paragraph" w:styleId="ListParagraph">
+  <w:style w:type="paragraph" w:styleId="a3">
     <w:name w:val="List Paragraph"/>
-    <w:basedOn w:val="Normal"/>
+    <w:basedOn w:val="a"/>
     <w:uiPriority w:val="34"/>
     <w:qFormat/>
     <w:rsid w:val="00FF5D67"/>
@@ -2445,10 +2190,10 @@
       <w:rFonts w:cs="Angsana New"/>
     </w:rPr>
   </w:style>
-  <w:style w:type="paragraph" w:styleId="BalloonText">
+  <w:style w:type="paragraph" w:styleId="a4">
     <w:name w:val="Balloon Text"/>
-    <w:basedOn w:val="Normal"/>
-    <w:link w:val="BalloonTextChar"/>
+    <w:basedOn w:val="a"/>
+    <w:link w:val="a5"/>
     <w:uiPriority w:val="99"/>
     <w:semiHidden/>
     <w:unhideWhenUsed/>
@@ -2462,10 +2207,10 @@
       <w:szCs w:val="22"/>
     </w:rPr>
   </w:style>
-  <w:style w:type="character" w:customStyle="1" w:styleId="BalloonTextChar">
-    <w:name w:val="Balloon Text Char"/>
-    <w:basedOn w:val="DefaultParagraphFont"/>
-    <w:link w:val="BalloonText"/>
+  <w:style w:type="character" w:customStyle="1" w:styleId="a5">
+    <w:name w:val="ข้อความบอลลูน อักขระ"/>
+    <w:basedOn w:val="a0"/>
+    <w:link w:val="a4"/>
     <w:uiPriority w:val="99"/>
     <w:semiHidden/>
     <w:rsid w:val="001809FD"/>

</xml_diff>

<commit_message>
Add Thai font support and client-side PDF printing
Register system/classpath fonts and configure XDocReport to use Identity-H/embedded fonts for proper Thai/Unicode PDF rendering. Add a synchronized one-time font registration helper and a custom IFontProvider in DocumentGenerationService. Replace server-side PDF link in the admin request detail template with a PDF button that fetches DOCX and generates a PDF client-side using docx-preview, html2canvas and jsPDF (loads libs from CDN, renders hidden container, saves PDF directly). Also updates document templates and uploaded DOCX files.
</commit_message>
<xml_diff>
--- a/shopping-cart-spring-boot-main/src/main/resources/templates/docx/doc_3.docx
+++ b/shopping-cart-spring-boot-main/src/main/resources/templates/docx/doc_3.docx
@@ -336,7 +336,27 @@
           <w:sz w:val="32"/>
           <w:szCs w:val="32"/>
         </w:rPr>
-        <w:t>{{no_year}}</w:t>
+        <w:t>{{</w:t>
+      </w:r>
+      <w:proofErr w:type="spellStart"/>
+      <w:r>
+        <w:rPr>
+          <w:rFonts w:ascii="TH Sarabun New" w:hAnsi="TH Sarabun New" w:cs="TH Sarabun New"/>
+          <w:color w:val="000000" w:themeColor="text1"/>
+          <w:sz w:val="32"/>
+          <w:szCs w:val="32"/>
+        </w:rPr>
+        <w:t>no_year</w:t>
+      </w:r>
+      <w:proofErr w:type="spellEnd"/>
+      <w:r>
+        <w:rPr>
+          <w:rFonts w:ascii="TH Sarabun New" w:hAnsi="TH Sarabun New" w:cs="TH Sarabun New"/>
+          <w:color w:val="000000" w:themeColor="text1"/>
+          <w:sz w:val="32"/>
+          <w:szCs w:val="32"/>
+        </w:rPr>
+        <w:t>}}</w:t>
       </w:r>
     </w:p>
     <w:p>
@@ -601,7 +621,43 @@
           <w:sz w:val="32"/>
           <w:szCs w:val="32"/>
         </w:rPr>
-        <w:t>{{dropdownname_applicant}} {{staff_type}}</w:t>
+        <w:t>{{</w:t>
+      </w:r>
+      <w:proofErr w:type="spellStart"/>
+      <w:r>
+        <w:rPr>
+          <w:rFonts w:ascii="TH Sarabun New" w:hAnsi="TH Sarabun New" w:cs="TH Sarabun New"/>
+          <w:sz w:val="32"/>
+          <w:szCs w:val="32"/>
+        </w:rPr>
+        <w:t>dropdownname_applicant</w:t>
+      </w:r>
+      <w:proofErr w:type="spellEnd"/>
+      <w:r>
+        <w:rPr>
+          <w:rFonts w:ascii="TH Sarabun New" w:hAnsi="TH Sarabun New" w:cs="TH Sarabun New"/>
+          <w:sz w:val="32"/>
+          <w:szCs w:val="32"/>
+        </w:rPr>
+        <w:t>}} {{</w:t>
+      </w:r>
+      <w:proofErr w:type="spellStart"/>
+      <w:r>
+        <w:rPr>
+          <w:rFonts w:ascii="TH Sarabun New" w:hAnsi="TH Sarabun New" w:cs="TH Sarabun New"/>
+          <w:sz w:val="32"/>
+          <w:szCs w:val="32"/>
+        </w:rPr>
+        <w:t>staff_type</w:t>
+      </w:r>
+      <w:proofErr w:type="spellEnd"/>
+      <w:r>
+        <w:rPr>
+          <w:rFonts w:ascii="TH Sarabun New" w:hAnsi="TH Sarabun New" w:cs="TH Sarabun New"/>
+          <w:sz w:val="32"/>
+          <w:szCs w:val="32"/>
+        </w:rPr>
+        <w:t>}}</w:t>
       </w:r>
       <w:r>
         <w:rPr>
@@ -628,7 +684,25 @@
           <w:sz w:val="32"/>
           <w:szCs w:val="32"/>
         </w:rPr>
-        <w:t>{{dropdown_position}}</w:t>
+        <w:t>{{</w:t>
+      </w:r>
+      <w:proofErr w:type="spellStart"/>
+      <w:r>
+        <w:rPr>
+          <w:rFonts w:ascii="TH Sarabun New" w:hAnsi="TH Sarabun New" w:cs="TH Sarabun New"/>
+          <w:sz w:val="32"/>
+          <w:szCs w:val="32"/>
+        </w:rPr>
+        <w:t>dropdown_position</w:t>
+      </w:r>
+      <w:proofErr w:type="spellEnd"/>
+      <w:r>
+        <w:rPr>
+          <w:rFonts w:ascii="TH Sarabun New" w:hAnsi="TH Sarabun New" w:cs="TH Sarabun New"/>
+          <w:sz w:val="32"/>
+          <w:szCs w:val="32"/>
+        </w:rPr>
+        <w:t>}}</w:t>
       </w:r>
       <w:r>
         <w:rPr>
@@ -655,7 +729,25 @@
           <w:sz w:val="32"/>
           <w:szCs w:val="32"/>
         </w:rPr>
-        <w:t>{{dropdown_positionnd}}</w:t>
+        <w:t>{{</w:t>
+      </w:r>
+      <w:proofErr w:type="spellStart"/>
+      <w:r>
+        <w:rPr>
+          <w:rFonts w:ascii="TH Sarabun New" w:hAnsi="TH Sarabun New" w:cs="TH Sarabun New"/>
+          <w:sz w:val="32"/>
+          <w:szCs w:val="32"/>
+        </w:rPr>
+        <w:t>dropdown_positionnd</w:t>
+      </w:r>
+      <w:proofErr w:type="spellEnd"/>
+      <w:r>
+        <w:rPr>
+          <w:rFonts w:ascii="TH Sarabun New" w:hAnsi="TH Sarabun New" w:cs="TH Sarabun New"/>
+          <w:sz w:val="32"/>
+          <w:szCs w:val="32"/>
+        </w:rPr>
+        <w:t>}}</w:t>
       </w:r>
     </w:p>
     <w:p>
@@ -1156,6 +1248,7 @@
         </w:rPr>
         <w:t>{{</w:t>
       </w:r>
+      <w:proofErr w:type="spellStart"/>
       <w:r>
         <w:rPr>
           <w:rFonts w:ascii="TH Sarabun New" w:hAnsi="TH Sarabun New" w:cs="TH Sarabun New"/>
@@ -1174,6 +1267,7 @@
         </w:rPr>
         <w:t>date</w:t>
       </w:r>
+      <w:proofErr w:type="spellEnd"/>
       <w:r>
         <w:rPr>
           <w:rFonts w:ascii="TH Sarabun New" w:hAnsi="TH Sarabun New" w:cs="TH Sarabun New"/>
@@ -1202,6 +1296,7 @@
         </w:rPr>
         <w:t>{{</w:t>
       </w:r>
+      <w:proofErr w:type="spellStart"/>
       <w:r>
         <w:rPr>
           <w:rFonts w:ascii="TH Sarabun New" w:hAnsi="TH Sarabun New" w:cs="TH Sarabun New"/>
@@ -1220,6 +1315,7 @@
         </w:rPr>
         <w:t>month</w:t>
       </w:r>
+      <w:proofErr w:type="spellEnd"/>
       <w:r>
         <w:rPr>
           <w:rFonts w:ascii="TH Sarabun New" w:hAnsi="TH Sarabun New" w:cs="TH Sarabun New"/>
@@ -1296,6 +1392,7 @@
         </w:rPr>
         <w:t>{{</w:t>
       </w:r>
+      <w:proofErr w:type="spellStart"/>
       <w:r>
         <w:rPr>
           <w:rFonts w:ascii="TH Sarabun New" w:hAnsi="TH Sarabun New" w:cs="TH Sarabun New"/>
@@ -1314,6 +1411,7 @@
         </w:rPr>
         <w:t>year</w:t>
       </w:r>
+      <w:proofErr w:type="spellEnd"/>
       <w:r>
         <w:rPr>
           <w:rFonts w:ascii="TH Sarabun New" w:hAnsi="TH Sarabun New" w:cs="TH Sarabun New"/>
@@ -1390,7 +1488,27 @@
           <w:sz w:val="32"/>
           <w:szCs w:val="32"/>
         </w:rPr>
-        <w:t>{{signed_day}}</w:t>
+        <w:t>{{</w:t>
+      </w:r>
+      <w:proofErr w:type="spellStart"/>
+      <w:r>
+        <w:rPr>
+          <w:rFonts w:ascii="TH Sarabun New" w:hAnsi="TH Sarabun New" w:cs="TH Sarabun New"/>
+          <w:color w:val="000000" w:themeColor="text1"/>
+          <w:sz w:val="32"/>
+          <w:szCs w:val="32"/>
+        </w:rPr>
+        <w:t>signed_day</w:t>
+      </w:r>
+      <w:proofErr w:type="spellEnd"/>
+      <w:r>
+        <w:rPr>
+          <w:rFonts w:ascii="TH Sarabun New" w:hAnsi="TH Sarabun New" w:cs="TH Sarabun New"/>
+          <w:color w:val="000000" w:themeColor="text1"/>
+          <w:sz w:val="32"/>
+          <w:szCs w:val="32"/>
+        </w:rPr>
+        <w:t>}}</w:t>
       </w:r>
       <w:r>
         <w:rPr>
@@ -1409,7 +1527,27 @@
           <w:sz w:val="32"/>
           <w:szCs w:val="32"/>
         </w:rPr>
-        <w:t xml:space="preserve">{{signed_month}} </w:t>
+        <w:t>{{</w:t>
+      </w:r>
+      <w:proofErr w:type="spellStart"/>
+      <w:r>
+        <w:rPr>
+          <w:rFonts w:ascii="TH Sarabun New" w:hAnsi="TH Sarabun New" w:cs="TH Sarabun New"/>
+          <w:color w:val="000000" w:themeColor="text1"/>
+          <w:sz w:val="32"/>
+          <w:szCs w:val="32"/>
+        </w:rPr>
+        <w:t>signed_month</w:t>
+      </w:r>
+      <w:proofErr w:type="spellEnd"/>
+      <w:r>
+        <w:rPr>
+          <w:rFonts w:ascii="TH Sarabun New" w:hAnsi="TH Sarabun New" w:cs="TH Sarabun New"/>
+          <w:color w:val="000000" w:themeColor="text1"/>
+          <w:sz w:val="32"/>
+          <w:szCs w:val="32"/>
+        </w:rPr>
+        <w:t xml:space="preserve">}} </w:t>
       </w:r>
       <w:r>
         <w:rPr>
@@ -1447,7 +1585,27 @@
           <w:sz w:val="32"/>
           <w:szCs w:val="32"/>
         </w:rPr>
-        <w:t>.{{signed_year}}</w:t>
+        <w:t>.{{</w:t>
+      </w:r>
+      <w:proofErr w:type="spellStart"/>
+      <w:r>
+        <w:rPr>
+          <w:rFonts w:ascii="TH Sarabun New" w:hAnsi="TH Sarabun New" w:cs="TH Sarabun New"/>
+          <w:color w:val="000000" w:themeColor="text1"/>
+          <w:sz w:val="32"/>
+          <w:szCs w:val="32"/>
+        </w:rPr>
+        <w:t>signed_year</w:t>
+      </w:r>
+      <w:proofErr w:type="spellEnd"/>
+      <w:r>
+        <w:rPr>
+          <w:rFonts w:ascii="TH Sarabun New" w:hAnsi="TH Sarabun New" w:cs="TH Sarabun New"/>
+          <w:color w:val="000000" w:themeColor="text1"/>
+          <w:sz w:val="32"/>
+          <w:szCs w:val="32"/>
+        </w:rPr>
+        <w:t>}}</w:t>
       </w:r>
       <w:r>
         <w:rPr>
@@ -1513,6 +1671,7 @@
         </w:rPr>
         <w:t>{{</w:t>
       </w:r>
+      <w:proofErr w:type="spellStart"/>
       <w:r>
         <w:rPr>
           <w:rFonts w:ascii="TH Sarabun New" w:hAnsi="TH Sarabun New" w:cs="TH Sarabun New"/>
@@ -1522,6 +1681,7 @@
         </w:rPr>
         <w:t>dean_name</w:t>
       </w:r>
+      <w:proofErr w:type="spellEnd"/>
       <w:r>
         <w:rPr>
           <w:rFonts w:ascii="TH Sarabun New" w:hAnsi="TH Sarabun New" w:cs="TH Sarabun New"/>
@@ -1560,7 +1720,17 @@
           <w:sz w:val="32"/>
           <w:szCs w:val="32"/>
         </w:rPr>
-        <w:t>{{dean</w:t>
+        <w:t>{{</w:t>
+      </w:r>
+      <w:proofErr w:type="spellStart"/>
+      <w:r>
+        <w:rPr>
+          <w:rFonts w:ascii="TH Sarabun New" w:hAnsi="TH Sarabun New" w:cs="TH Sarabun New"/>
+          <w:color w:val="000000" w:themeColor="text1"/>
+          <w:sz w:val="32"/>
+          <w:szCs w:val="32"/>
+        </w:rPr>
+        <w:t>dean</w:t>
       </w:r>
       <w:r>
         <w:rPr>
@@ -1578,7 +1748,17 @@
           <w:sz w:val="32"/>
           <w:szCs w:val="32"/>
         </w:rPr>
-        <w:t>_position}}</w:t>
+        <w:t>_position</w:t>
+      </w:r>
+      <w:proofErr w:type="spellEnd"/>
+      <w:r>
+        <w:rPr>
+          <w:rFonts w:ascii="TH Sarabun New" w:hAnsi="TH Sarabun New" w:cs="TH Sarabun New"/>
+          <w:color w:val="000000" w:themeColor="text1"/>
+          <w:sz w:val="32"/>
+          <w:szCs w:val="32"/>
+        </w:rPr>
+        <w:t>}}</w:t>
       </w:r>
     </w:p>
     <w:p>

</xml_diff>

<commit_message>
Add presentation slides and update DOCX 3,4 templates
Add a new Reveal.js presentation at presentation/slides.html containing a full Thai-language slide deck (styles, layout, and content) for the HRCP.KKU project. Also update the DOCX template shopping-cart-spring-boot-main/src/main/resources/templates/docx/doc_3.docx and add a temporary/editor file (~$doc_4.docx) in the same templates directory. Slides provide project overview, architecture, workflow, features and results; DOCX updates relate to template/content changes.
</commit_message>
<xml_diff>
--- a/shopping-cart-spring-boot-main/src/main/resources/templates/docx/doc_3.docx
+++ b/shopping-cart-spring-boot-main/src/main/resources/templates/docx/doc_3.docx
@@ -1207,7 +1207,7 @@
           <w:szCs w:val="32"/>
           <w:cs/>
         </w:rPr>
-        <w:t>และเลาขานุการ</w:t>
+        <w:t>และเลขานุการ</w:t>
       </w:r>
     </w:p>
     <w:p>
@@ -1327,61 +1327,12 @@
       </w:r>
       <w:r>
         <w:rPr>
-          <w:rFonts w:ascii="TH Sarabun New" w:hAnsi="TH Sarabun New" w:cs="TH Sarabun New" w:hint="cs"/>
-          <w:color w:val="000000" w:themeColor="text1"/>
-          <w:sz w:val="32"/>
-          <w:szCs w:val="32"/>
-          <w:cs/>
-        </w:rPr>
-        <w:t xml:space="preserve"> </w:t>
-      </w:r>
-      <w:r>
-        <w:rPr>
-          <w:rFonts w:ascii="TH Sarabun New" w:hAnsi="TH Sarabun New" w:cs="TH Sarabun New" w:hint="cs"/>
-          <w:color w:val="000000" w:themeColor="text1"/>
-          <w:sz w:val="32"/>
-          <w:szCs w:val="32"/>
-          <w:cs/>
-        </w:rPr>
-        <w:t>พ</w:t>
-      </w:r>
-      <w:r>
-        <w:rPr>
-          <w:rFonts w:ascii="TH Sarabun New" w:hAnsi="TH Sarabun New" w:cs="TH Sarabun New"/>
-          <w:color w:val="000000" w:themeColor="text1"/>
-          <w:sz w:val="32"/>
-          <w:szCs w:val="32"/>
-        </w:rPr>
-        <w:t>.</w:t>
-      </w:r>
-      <w:r>
-        <w:rPr>
-          <w:rFonts w:ascii="TH Sarabun New" w:hAnsi="TH Sarabun New" w:cs="TH Sarabun New" w:hint="cs"/>
-          <w:color w:val="000000" w:themeColor="text1"/>
-          <w:sz w:val="32"/>
-          <w:szCs w:val="32"/>
-          <w:cs/>
-        </w:rPr>
-        <w:t>ศ</w:t>
-      </w:r>
-      <w:r>
-        <w:rPr>
-          <w:rFonts w:ascii="TH Sarabun New" w:hAnsi="TH Sarabun New" w:cs="TH Sarabun New"/>
-          <w:color w:val="000000" w:themeColor="text1"/>
-          <w:sz w:val="32"/>
-          <w:szCs w:val="32"/>
-        </w:rPr>
-        <w:t>.</w:t>
-      </w:r>
-      <w:r>
-        <w:rPr>
-          <w:rFonts w:ascii="TH Sarabun New" w:hAnsi="TH Sarabun New" w:cs="TH Sarabun New" w:hint="cs"/>
+          <w:rFonts w:ascii="TH Sarabun New" w:hAnsi="TH Sarabun New" w:cs="TH Sarabun New"/>
           <w:color w:val="EE0000"/>
           <w:sz w:val="32"/>
           <w:szCs w:val="32"/>
-          <w:cs/>
-        </w:rPr>
-        <w:t xml:space="preserve"> </w:t>
+        </w:rPr>
+        <w:t xml:space="preserve">  </w:t>
       </w:r>
       <w:r>
         <w:rPr>
@@ -1547,7 +1498,25 @@
           <w:sz w:val="32"/>
           <w:szCs w:val="32"/>
         </w:rPr>
-        <w:t xml:space="preserve">}} </w:t>
+        <w:t>}}</w:t>
+      </w:r>
+      <w:r>
+        <w:rPr>
+          <w:rFonts w:ascii="TH Sarabun New" w:hAnsi="TH Sarabun New" w:cs="TH Sarabun New"/>
+          <w:color w:val="000000" w:themeColor="text1"/>
+          <w:sz w:val="32"/>
+          <w:szCs w:val="32"/>
+        </w:rPr>
+        <w:t xml:space="preserve"> </w:t>
+      </w:r>
+      <w:r>
+        <w:rPr>
+          <w:rFonts w:ascii="TH Sarabun New" w:hAnsi="TH Sarabun New" w:cs="TH Sarabun New"/>
+          <w:color w:val="000000" w:themeColor="text1"/>
+          <w:sz w:val="32"/>
+          <w:szCs w:val="32"/>
+        </w:rPr>
+        <w:t xml:space="preserve"> </w:t>
       </w:r>
       <w:r>
         <w:rPr>
@@ -1585,7 +1554,25 @@
           <w:sz w:val="32"/>
           <w:szCs w:val="32"/>
         </w:rPr>
-        <w:t>.{{</w:t>
+        <w:t>.</w:t>
+      </w:r>
+      <w:r>
+        <w:rPr>
+          <w:rFonts w:ascii="TH Sarabun New" w:hAnsi="TH Sarabun New" w:cs="TH Sarabun New"/>
+          <w:color w:val="000000" w:themeColor="text1"/>
+          <w:sz w:val="32"/>
+          <w:szCs w:val="32"/>
+        </w:rPr>
+        <w:t xml:space="preserve"> </w:t>
+      </w:r>
+      <w:r>
+        <w:rPr>
+          <w:rFonts w:ascii="TH Sarabun New" w:hAnsi="TH Sarabun New" w:cs="TH Sarabun New"/>
+          <w:color w:val="000000" w:themeColor="text1"/>
+          <w:sz w:val="32"/>
+          <w:szCs w:val="32"/>
+        </w:rPr>
+        <w:t>{{</w:t>
       </w:r>
       <w:proofErr w:type="spellStart"/>
       <w:r>

</xml_diff>